<commit_message>
update: modulados img type and data.js
</commit_message>
<xml_diff>
--- a/src/modulados/painelmodelos/Painel Modelo 3/valor.docx
+++ b/src/modulados/painelmodelos/Painel Modelo 3/valor.docx
@@ -4,17 +4,7 @@
   <w:body>
     <w:p>
       <w:pPr>
-        <w:rPr/>
-      </w:pPr>
-      <w:r>
-        <w:rPr>
-          <w:rtl w:val="0"/>
-        </w:rPr>
-        <w:t xml:space="preserve">Painel modelo 3</w:t>
-      </w:r>
-    </w:p>
-    <w:p>
-      <w:pPr>
+        <w:spacing w:after="240" w:before="240" w:lineRule="auto"/>
         <w:rPr/>
       </w:pPr>
       <w:r>
@@ -31,11 +21,10 @@
         <w:rPr>
           <w:rtl w:val="0"/>
         </w:rPr>
-        <w:t xml:space="preserve">2.640,00</w:t>
       </w:r>
     </w:p>
     <w:sectPr>
-      <w:pgSz w:h="16834" w:w="11909" w:orient="portrait"/>
+      <w:pgSz w:h="11909" w:w="16834" w:orient="landscape"/>
       <w:pgMar w:bottom="1440" w:top="1440" w:left="1440" w:right="1440" w:header="720" w:footer="720"/>
       <w:pgNumType w:start="1"/>
     </w:sectPr>

</xml_diff>